<commit_message>
added code for plant_crops
</commit_message>
<xml_diff>
--- a/project details/results documentation.docx
+++ b/project details/results documentation.docx
@@ -31,7 +31,15 @@
     </w:p>
     <w:p>
       <w:r>
-        <w:t>Water needs to collected to plant water. Reach the water tank to collect water</w:t>
+        <w:t xml:space="preserve">Water needs to </w:t>
+      </w:r>
+      <w:proofErr w:type="gramStart"/>
+      <w:r>
+        <w:t>collected</w:t>
+      </w:r>
+      <w:proofErr w:type="gramEnd"/>
+      <w:r>
+        <w:t xml:space="preserve"> to plant water. Reach the water tank to collect water</w:t>
       </w:r>
     </w:p>
     <w:p>
@@ -46,28 +54,12 @@
     </w:p>
     <w:p>
       <w:r>
-        <w:t>Grid size: {state['</w:t>
-      </w:r>
-      <w:proofErr w:type="spellStart"/>
-      <w:r>
-        <w:t>grid_size</w:t>
-      </w:r>
-      <w:proofErr w:type="spellEnd"/>
-      <w:r>
-        <w:t>']}</w:t>
-      </w:r>
-    </w:p>
-    <w:p>
-      <w:r>
-        <w:t>Player position: {tuple(state['</w:t>
-      </w:r>
-      <w:proofErr w:type="spellStart"/>
-      <w:r>
-        <w:t>player_pos</w:t>
-      </w:r>
-      <w:proofErr w:type="spellEnd"/>
-      <w:r>
-        <w:t>'])}</w:t>
+        <w:t>Grid size: {state['grid_size']}</w:t>
+      </w:r>
+    </w:p>
+    <w:p>
+      <w:r>
+        <w:t>Player position: {tuple(state['player_pos'])}</w:t>
       </w:r>
     </w:p>
     <w:p>
@@ -77,15 +69,7 @@
     </w:p>
     <w:p>
       <w:r>
-        <w:t>{</w:t>
-      </w:r>
-      <w:proofErr w:type="spellStart"/>
-      <w:r>
-        <w:t>crops_to_text</w:t>
-      </w:r>
-      <w:proofErr w:type="spellEnd"/>
-      <w:r>
-        <w:t>(state['crops'])}</w:t>
+        <w:t>{crops_to_text(state['crops'])}</w:t>
       </w:r>
     </w:p>
     <w:p>
@@ -99,39 +83,18 @@
       </w:r>
     </w:p>
     <w:p>
-      <w:proofErr w:type="spellStart"/>
-      <w:r>
-        <w:t>Water_tank</w:t>
-      </w:r>
-      <w:proofErr w:type="spellEnd"/>
-      <w:r>
-        <w:t>:</w:t>
-      </w:r>
-    </w:p>
-    <w:p>
-      <w:r>
-        <w:t>{list(state['</w:t>
-      </w:r>
-      <w:proofErr w:type="spellStart"/>
-      <w:r>
-        <w:t>water_tank</w:t>
-      </w:r>
-      <w:proofErr w:type="spellEnd"/>
-      <w:r>
-        <w:t>'])}</w:t>
-      </w:r>
-    </w:p>
-    <w:p>
-      <w:r>
-        <w:t xml:space="preserve">  To calculate the distance should use the </w:t>
-      </w:r>
-      <w:proofErr w:type="spellStart"/>
-      <w:r>
-        <w:t>astar</w:t>
-      </w:r>
-      <w:proofErr w:type="spellEnd"/>
-      <w:r>
-        <w:t xml:space="preserve"> algorithm tool</w:t>
+      <w:r>
+        <w:t>Water_tank:</w:t>
+      </w:r>
+    </w:p>
+    <w:p>
+      <w:r>
+        <w:t>{list(state['water_tank'])}</w:t>
+      </w:r>
+    </w:p>
+    <w:p>
+      <w:r>
+        <w:t xml:space="preserve">  To calculate the distance should use the astar algorithm tool</w:t>
       </w:r>
     </w:p>
     <w:p>
@@ -161,15 +124,7 @@
     </w:p>
     <w:p>
       <w:r>
-        <w:t xml:space="preserve">No of </w:t>
-      </w:r>
-      <w:proofErr w:type="spellStart"/>
-      <w:r>
-        <w:t>llms</w:t>
-      </w:r>
-      <w:proofErr w:type="spellEnd"/>
-      <w:r>
-        <w:t xml:space="preserve"> calls:-</w:t>
+        <w:t>No of llms calls:-</w:t>
       </w:r>
     </w:p>
     <w:p>
@@ -229,15 +184,7 @@
     </w:p>
     <w:p>
       <w:r>
-        <w:t xml:space="preserve">No of </w:t>
-      </w:r>
-      <w:proofErr w:type="spellStart"/>
-      <w:r>
-        <w:t>llms</w:t>
-      </w:r>
-      <w:proofErr w:type="spellEnd"/>
-      <w:r>
-        <w:t xml:space="preserve"> calls:-</w:t>
+        <w:t>No of llms calls:-</w:t>
       </w:r>
     </w:p>
     <w:p>
@@ -296,15 +243,7 @@
     </w:p>
     <w:p>
       <w:r>
-        <w:t xml:space="preserve">No of </w:t>
-      </w:r>
-      <w:proofErr w:type="spellStart"/>
-      <w:r>
-        <w:t>llms</w:t>
-      </w:r>
-      <w:proofErr w:type="spellEnd"/>
-      <w:r>
-        <w:t xml:space="preserve"> calls:-</w:t>
+        <w:t>No of llms calls:-</w:t>
       </w:r>
     </w:p>
     <w:p>
@@ -314,15 +253,7 @@
     </w:p>
     <w:p>
       <w:r>
-        <w:t xml:space="preserve">player </w:t>
-      </w:r>
-      <w:proofErr w:type="spellStart"/>
-      <w:r>
-        <w:t>positons</w:t>
-      </w:r>
-      <w:proofErr w:type="spellEnd"/>
-      <w:r>
-        <w:t>:</w:t>
+        <w:t>player positons:</w:t>
       </w:r>
     </w:p>
     <w:p>
@@ -417,15 +348,7 @@
     </w:p>
     <w:p>
       <w:r>
-        <w:t xml:space="preserve">No of </w:t>
-      </w:r>
-      <w:proofErr w:type="spellStart"/>
-      <w:r>
-        <w:t>llms</w:t>
-      </w:r>
-      <w:proofErr w:type="spellEnd"/>
-      <w:r>
-        <w:t xml:space="preserve"> calls:-</w:t>
+        <w:t>No of llms calls:-</w:t>
       </w:r>
     </w:p>
     <w:p>
@@ -435,15 +358,7 @@
     </w:p>
     <w:p>
       <w:r>
-        <w:t xml:space="preserve">player </w:t>
-      </w:r>
-      <w:proofErr w:type="spellStart"/>
-      <w:r>
-        <w:t>positons</w:t>
-      </w:r>
-      <w:proofErr w:type="spellEnd"/>
-      <w:r>
-        <w:t>:</w:t>
+        <w:t>player positons:</w:t>
       </w:r>
     </w:p>
     <w:p>
@@ -516,15 +431,7 @@
     </w:p>
     <w:p>
       <w:r>
-        <w:t xml:space="preserve">No of </w:t>
-      </w:r>
-      <w:proofErr w:type="spellStart"/>
-      <w:r>
-        <w:t>llms</w:t>
-      </w:r>
-      <w:proofErr w:type="spellEnd"/>
-      <w:r>
-        <w:t xml:space="preserve"> calls:-</w:t>
+        <w:t>No of llms calls:-</w:t>
       </w:r>
     </w:p>
     <w:p>
@@ -534,15 +441,7 @@
     </w:p>
     <w:p>
       <w:r>
-        <w:t xml:space="preserve">player </w:t>
-      </w:r>
-      <w:proofErr w:type="spellStart"/>
-      <w:r>
-        <w:t>positons</w:t>
-      </w:r>
-      <w:proofErr w:type="spellEnd"/>
-      <w:r>
-        <w:t>:</w:t>
+        <w:t>player positons:</w:t>
       </w:r>
     </w:p>
     <w:p>
@@ -563,42 +462,18 @@
         <w:rPr>
           <w:b/>
           <w:bCs/>
-        </w:rPr>
-      </w:pPr>
-      <w:r>
-        <w:rPr>
-          <w:b/>
-          <w:bCs/>
-        </w:rPr>
-        <w:t>With adding water tank(</w:t>
-      </w:r>
-      <w:r>
-        <w:rPr>
-          <w:b/>
-          <w:bCs/>
-        </w:rPr>
-        <w:t>80</w:t>
-      </w:r>
-      <w:r>
-        <w:rPr>
-          <w:b/>
-          <w:bCs/>
-        </w:rPr>
-        <w:t>,</w:t>
-      </w:r>
-      <w:r>
-        <w:rPr>
-          <w:b/>
-          <w:bCs/>
-        </w:rPr>
-        <w:t>25</w:t>
-      </w:r>
-      <w:r>
-        <w:rPr>
-          <w:b/>
-          <w:bCs/>
-        </w:rPr>
-        <w:t xml:space="preserve">0) prompt </w:t>
+          <w:sz w:val="32"/>
+          <w:szCs w:val="32"/>
+        </w:rPr>
+      </w:pPr>
+      <w:r>
+        <w:rPr>
+          <w:b/>
+          <w:bCs/>
+          <w:sz w:val="32"/>
+          <w:szCs w:val="32"/>
+        </w:rPr>
+        <w:t xml:space="preserve">With adding water tank(80,250) prompt </w:t>
       </w:r>
     </w:p>
     <w:p>
@@ -610,24 +485,16 @@
     </w:p>
     <w:p>
       <w:r>
-        <w:t xml:space="preserve">[16.271975994110107, 3.7866098880767822, 1.2479028701782227, 1.0684106349945068, 0.710425853729248, 0.850165843963623, 0.7665755748748779, 0.784276008605957, 0.7693824768066406, 0.9315853118896484, 0.8580341339111328, 0.8959176540374756, 0.9488439559936523, 0.9792425632476807, 0.9698607921600342, 2.288149356842041, </w:t>
+        <w:t xml:space="preserve">[16.271975994110107, 3.7866098880767822, 1.2479028701782227, 1.0684106349945068, 0.710425853729248, 0.850165843963623, 0.7665755748748779, 0.784276008605957, 0.7693824768066406, 0.9315853118896484, 0.8580341339111328, 0.8959176540374756, </w:t>
       </w:r>
       <w:r>
         <w:lastRenderedPageBreak/>
-        <w:t>1.1659371852874756, 1.1724231243133545, 1.2971181869506836, 1.3469157218933105, 1.4097189903259277, 1.4271085262298584, 1.4969675540924072, 1.530214786529541, 1.5950512886047363, 1.7499973773956299, 1.7046668529510498, 1.9973549842834473, 2.042006492614746, 2.0939018726348877, 2.1858863830566406, 2.3150267601013184, 2.3580782413482666, 2.4960410594940186, 2.4875400066375732]</w:t>
-      </w:r>
-    </w:p>
-    <w:p>
-      <w:r>
-        <w:t xml:space="preserve">No of </w:t>
-      </w:r>
-      <w:proofErr w:type="spellStart"/>
-      <w:r>
-        <w:t>llms</w:t>
-      </w:r>
-      <w:proofErr w:type="spellEnd"/>
-      <w:r>
-        <w:t xml:space="preserve"> calls:-</w:t>
+        <w:t>0.9488439559936523, 0.9792425632476807, 0.9698607921600342, 2.288149356842041, 1.1659371852874756, 1.1724231243133545, 1.2971181869506836, 1.3469157218933105, 1.4097189903259277, 1.4271085262298584, 1.4969675540924072, 1.530214786529541, 1.5950512886047363, 1.7499973773956299, 1.7046668529510498, 1.9973549842834473, 2.042006492614746, 2.0939018726348877, 2.1858863830566406, 2.3150267601013184, 2.3580782413482666, 2.4960410594940186, 2.4875400066375732]</w:t>
+      </w:r>
+    </w:p>
+    <w:p>
+      <w:r>
+        <w:t>No of llms calls:-</w:t>
       </w:r>
     </w:p>
     <w:p>
@@ -637,15 +504,7 @@
     </w:p>
     <w:p>
       <w:r>
-        <w:t xml:space="preserve">player </w:t>
-      </w:r>
-      <w:proofErr w:type="spellStart"/>
-      <w:r>
-        <w:t>positons</w:t>
-      </w:r>
-      <w:proofErr w:type="spellEnd"/>
-      <w:r>
-        <w:t>:</w:t>
+        <w:t>player positons:</w:t>
       </w:r>
     </w:p>
     <w:p>
@@ -678,6 +537,8 @@
     <w:p>
       <w:pPr>
         <w:rPr>
+          <w:sz w:val="36"/>
+          <w:szCs w:val="36"/>
           <w:lang w:val="de-DE"/>
         </w:rPr>
       </w:pPr>
@@ -687,12 +548,16 @@
         <w:rPr>
           <w:b/>
           <w:bCs/>
-        </w:rPr>
-      </w:pPr>
-      <w:r>
-        <w:rPr>
-          <w:b/>
-          <w:bCs/>
+          <w:sz w:val="36"/>
+          <w:szCs w:val="36"/>
+        </w:rPr>
+      </w:pPr>
+      <w:r>
+        <w:rPr>
+          <w:b/>
+          <w:bCs/>
+          <w:sz w:val="36"/>
+          <w:szCs w:val="36"/>
         </w:rPr>
         <w:t>Issue with tool calling</w:t>
       </w:r>
@@ -702,12 +567,16 @@
         <w:rPr>
           <w:b/>
           <w:bCs/>
-        </w:rPr>
-      </w:pPr>
-      <w:r>
-        <w:rPr>
-          <w:b/>
-          <w:bCs/>
+          <w:sz w:val="36"/>
+          <w:szCs w:val="36"/>
+        </w:rPr>
+      </w:pPr>
+      <w:r>
+        <w:rPr>
+          <w:b/>
+          <w:bCs/>
+          <w:sz w:val="36"/>
+          <w:szCs w:val="36"/>
         </w:rPr>
         <w:t>1</w:t>
       </w:r>
@@ -715,6 +584,8 @@
         <w:rPr>
           <w:b/>
           <w:bCs/>
+          <w:sz w:val="36"/>
+          <w:szCs w:val="36"/>
         </w:rPr>
         <w:t xml:space="preserve">) for a </w:t>
       </w:r>
@@ -722,6 +593,8 @@
         <w:rPr>
           <w:b/>
           <w:bCs/>
+          <w:sz w:val="36"/>
+          <w:szCs w:val="36"/>
         </w:rPr>
         <w:t>water tool</w:t>
       </w:r>
@@ -733,59 +606,34 @@
     </w:p>
     <w:p>
       <w:r>
-        <w:t xml:space="preserve">  File "D:\thowl_work\research project prework\</w:t>
-      </w:r>
-      <w:proofErr w:type="spellStart"/>
-      <w:r>
-        <w:t>llms</w:t>
-      </w:r>
-      <w:proofErr w:type="spellEnd"/>
-      <w:r>
-        <w:t xml:space="preserve"> and robotics\ai agents\agentic_approach2.py", line 203, in &lt;module&gt;</w:t>
-      </w:r>
-    </w:p>
-    <w:p>
-      <w:r>
-        <w:t xml:space="preserve">    result = </w:t>
-      </w:r>
-      <w:proofErr w:type="spellStart"/>
-      <w:r>
-        <w:t>function_to_call</w:t>
-      </w:r>
-      <w:proofErr w:type="spellEnd"/>
-      <w:r>
-        <w:t>(**</w:t>
-      </w:r>
-      <w:proofErr w:type="spellStart"/>
-      <w:r>
-        <w:t>tool_call.function.arguments</w:t>
-      </w:r>
-      <w:proofErr w:type="spellEnd"/>
-      <w:r>
-        <w:t>)</w:t>
-      </w:r>
-    </w:p>
-    <w:p>
-      <w:proofErr w:type="spellStart"/>
-      <w:r>
-        <w:t>TypeError</w:t>
-      </w:r>
-      <w:proofErr w:type="spellEnd"/>
-      <w:r>
-        <w:t>: water() got an unexpected keyword argument 'dx'</w:t>
-      </w:r>
-    </w:p>
-    <w:p>
-      <w:pPr>
-        <w:rPr>
-          <w:b/>
-          <w:bCs/>
-        </w:rPr>
-      </w:pPr>
-      <w:r>
-        <w:rPr>
-          <w:b/>
-          <w:bCs/>
+        <w:t xml:space="preserve">  File "D:\thowl_work\research project prework\llms and robotics\ai agents\agentic_approach2.py", line 203, in &lt;module&gt;</w:t>
+      </w:r>
+    </w:p>
+    <w:p>
+      <w:r>
+        <w:t xml:space="preserve">    result = function_to_call(**tool_call.function.arguments)</w:t>
+      </w:r>
+    </w:p>
+    <w:p>
+      <w:r>
+        <w:t>TypeError: water() got an unexpected keyword argument 'dx'</w:t>
+      </w:r>
+    </w:p>
+    <w:p>
+      <w:pPr>
+        <w:rPr>
+          <w:b/>
+          <w:bCs/>
+          <w:sz w:val="28"/>
+          <w:szCs w:val="28"/>
+        </w:rPr>
+      </w:pPr>
+      <w:r>
+        <w:rPr>
+          <w:b/>
+          <w:bCs/>
+          <w:sz w:val="28"/>
+          <w:szCs w:val="28"/>
         </w:rPr>
         <w:t>2) for a star</w:t>
       </w:r>
@@ -807,93 +655,28 @@
     </w:p>
     <w:p>
       <w:r>
-        <w:t xml:space="preserve">  File "D:\thowl_work\research project prework\</w:t>
-      </w:r>
-      <w:proofErr w:type="spellStart"/>
-      <w:r>
-        <w:t>llms</w:t>
-      </w:r>
-      <w:proofErr w:type="spellEnd"/>
-      <w:r>
-        <w:t xml:space="preserve"> and robotics\ai agents\agentic_approach2.py", line 205, in &lt;module&gt;</w:t>
-      </w:r>
-    </w:p>
-    <w:p>
-      <w:r>
-        <w:t xml:space="preserve">    result = </w:t>
-      </w:r>
-      <w:proofErr w:type="spellStart"/>
-      <w:r>
-        <w:t>function_to_call</w:t>
-      </w:r>
-      <w:proofErr w:type="spellEnd"/>
-      <w:r>
-        <w:t>(**</w:t>
-      </w:r>
-      <w:proofErr w:type="spellStart"/>
-      <w:r>
-        <w:t>tool_call.function.arguments</w:t>
-      </w:r>
-      <w:proofErr w:type="spellEnd"/>
-      <w:r>
-        <w:t>)</w:t>
-      </w:r>
-    </w:p>
-    <w:p>
-      <w:r>
-        <w:t xml:space="preserve">  File "D:\thowl_work\research project prework\</w:t>
-      </w:r>
-      <w:proofErr w:type="spellStart"/>
-      <w:r>
-        <w:t>llms</w:t>
-      </w:r>
-      <w:proofErr w:type="spellEnd"/>
-      <w:r>
-        <w:t xml:space="preserve"> and robotics\ai agents\a_star_algo.py", line 42, in </w:t>
-      </w:r>
-      <w:proofErr w:type="spellStart"/>
-      <w:r>
-        <w:t>astar</w:t>
-      </w:r>
-      <w:proofErr w:type="spellEnd"/>
-    </w:p>
-    <w:p>
-      <w:r>
-        <w:t xml:space="preserve">    </w:t>
-      </w:r>
-      <w:proofErr w:type="spellStart"/>
-      <w:r>
-        <w:t>new_st</w:t>
-      </w:r>
-      <w:proofErr w:type="spellEnd"/>
-      <w:r>
-        <w:t xml:space="preserve"> = (int(</w:t>
-      </w:r>
-      <w:proofErr w:type="spellStart"/>
-      <w:r>
-        <w:t>start_px.split</w:t>
-      </w:r>
-      <w:proofErr w:type="spellEnd"/>
-      <w:r>
-        <w:t>(",")[0]),int(</w:t>
-      </w:r>
-      <w:proofErr w:type="spellStart"/>
-      <w:r>
-        <w:t>start_px.split</w:t>
-      </w:r>
-      <w:proofErr w:type="spellEnd"/>
-      <w:r>
-        <w:t>(",")[1]))</w:t>
-      </w:r>
-    </w:p>
-    <w:p>
-      <w:proofErr w:type="spellStart"/>
-      <w:r>
-        <w:t>ValueError</w:t>
-      </w:r>
-      <w:proofErr w:type="spellEnd"/>
-      <w:r>
-        <w:t>: invalid literal for int() with base 10: '(200'</w:t>
+        <w:t xml:space="preserve">  File "D:\thowl_work\research project prework\llms and robotics\ai agents\agentic_approach2.py", line 205, in &lt;module&gt;</w:t>
+      </w:r>
+    </w:p>
+    <w:p>
+      <w:r>
+        <w:t xml:space="preserve">    result = function_to_call(**tool_call.function.arguments)</w:t>
+      </w:r>
+    </w:p>
+    <w:p>
+      <w:r>
+        <w:t xml:space="preserve">  File "D:\thowl_work\research project prework\llms and robotics\ai agents\a_star_algo.py", line 42, in astar</w:t>
+      </w:r>
+    </w:p>
+    <w:p>
+      <w:r>
+        <w:t xml:space="preserve">    new_st = (int(start_px.split(",")[0]),int(start_px.split(",")[1]))</w:t>
+      </w:r>
+    </w:p>
+    <w:p>
+      <w:r>
+        <w:lastRenderedPageBreak/>
+        <w:t>ValueError: invalid literal for int() with base 10: '(200'</w:t>
       </w:r>
     </w:p>
     <w:p/>
@@ -902,612 +685,1064 @@
         <w:rPr>
           <w:b/>
           <w:bCs/>
-        </w:rPr>
-      </w:pPr>
-      <w:r>
-        <w:rPr>
-          <w:b/>
-          <w:bCs/>
-        </w:rPr>
+          <w:sz w:val="36"/>
+          <w:szCs w:val="36"/>
+        </w:rPr>
+      </w:pPr>
+      <w:r>
+        <w:rPr>
+          <w:b/>
+          <w:bCs/>
+          <w:sz w:val="36"/>
+          <w:szCs w:val="36"/>
+        </w:rPr>
+        <w:t>Unknown error</w:t>
+      </w:r>
+    </w:p>
+    <w:p>
+      <w:pPr>
+        <w:rPr>
+          <w:b/>
+          <w:bCs/>
+        </w:rPr>
+      </w:pPr>
+    </w:p>
+    <w:p/>
+    <w:p>
+      <w:r>
+        <w:t>[]</w:t>
+      </w:r>
+    </w:p>
+    <w:p>
+      <w:r>
+        <w:t>D:\thowl_work\research project prework\llms and robotics\ai agents\my_env\lib\site-packages\numpy\_core\fromnumeric.py:3596: RuntimeWarning: Mean of empty slice.</w:t>
+      </w:r>
+    </w:p>
+    <w:p>
+      <w:r>
+        <w:t xml:space="preserve">  return _methods._mean(a, axis=axis, dtype=dtype,</w:t>
+      </w:r>
+    </w:p>
+    <w:p>
+      <w:r>
+        <w:t>D:\thowl_work\research project prework\llms and robotics\ai agents\my_env\lib\site-packages\numpy\_core\_methods.py:138: RuntimeWarning: invalid value encountered in scalar divide</w:t>
+      </w:r>
+    </w:p>
+    <w:p>
+      <w:r>
+        <w:t xml:space="preserve">  ret = ret.dtype.type(ret / rcount)</w:t>
+      </w:r>
+    </w:p>
+    <w:p>
+      <w:r>
+        <w:t>D:\thowl_work\research project prework\llms and robotics\ai agents\my_env\lib\site-packages\numpy\_core\fromnumeric.py:4008: RuntimeWarning: Degrees of freedom &lt;= 0 for slice</w:t>
+      </w:r>
+    </w:p>
+    <w:p>
+      <w:r>
+        <w:t xml:space="preserve">  return _methods._var(a, axis=axis, dtype=dtype, out=out, ddof=ddof,</w:t>
+      </w:r>
+    </w:p>
+    <w:p>
+      <w:r>
+        <w:t>D:\thowl_work\research project prework\llms and robotics\ai agents\my_env\lib\site-packages\numpy\_core\_methods.py:175: RuntimeWarning: invalid value encountered in divide</w:t>
+      </w:r>
+    </w:p>
+    <w:p>
+      <w:r>
+        <w:t xml:space="preserve">  arrmean = um.true_divide(arrmean, div, out=arrmean,</w:t>
+      </w:r>
+    </w:p>
+    <w:p>
+      <w:r>
+        <w:t>D:\thowl_work\research project prework\llms and robotics\ai agents\my_env\lib\site-packages\numpy\_core\_methods.py:210: RuntimeWarning: invalid value encountered in scalar divide</w:t>
+      </w:r>
+    </w:p>
+    <w:p>
+      <w:r>
+        <w:t xml:space="preserve">  ret = ret.dtype.type(ret / rcount)</w:t>
+      </w:r>
+    </w:p>
+    <w:p>
+      <w:r>
+        <w:t>D:\thowl_work\research project prework\llms and robotics\ai agents\my_env\lib\site-packages\numpy\_core\_methods.py:218: RuntimeWarning: Degrees of freedom &lt;= 0 for slice</w:t>
+      </w:r>
+    </w:p>
+    <w:p>
+      <w:r>
+        <w:t xml:space="preserve">  ret = _var(a, axis=axis, dtype=dtype, out=out, ddof=ddof,</w:t>
+      </w:r>
+    </w:p>
+    <w:p>
+      <w:r>
+        <w:t>Traceback (most recent call last):</w:t>
+      </w:r>
+    </w:p>
+    <w:p>
+      <w:r>
+        <w:t xml:space="preserve">  File "D:\thowl_work\research project prework\llms and robotics\ai agents\agentic_approach2.py", line 263, in &lt;module&gt;</w:t>
+      </w:r>
+    </w:p>
+    <w:p>
+      <w:r>
+        <w:t xml:space="preserve">    min_val = np.min(data)</w:t>
+      </w:r>
+    </w:p>
+    <w:p>
+      <w:r>
+        <w:t xml:space="preserve">  File "D:\thowl_work\research project prework\llms and robotics\ai agents\my_env\lib\site-packages\numpy\_core\fromnumeric.py", line 3042, in min</w:t>
+      </w:r>
+    </w:p>
+    <w:p>
+      <w:r>
+        <w:t xml:space="preserve">    return _wrapreduction(a, np.minimum, 'min', axis, None, out,</w:t>
+      </w:r>
+    </w:p>
+    <w:p>
+      <w:r>
         <w:lastRenderedPageBreak/>
-        <w:t>Unknown error</w:t>
-      </w:r>
-    </w:p>
-    <w:p>
-      <w:pPr>
-        <w:rPr>
-          <w:b/>
-          <w:bCs/>
-        </w:rPr>
-      </w:pPr>
+        <w:t xml:space="preserve">  File "D:\thowl_work\research project prework\llms and robotics\ai agents\my_env\lib\site-packages\numpy\_core\fromnumeric.py", line 86, in _wrapreduction</w:t>
+      </w:r>
+    </w:p>
+    <w:p>
+      <w:r>
+        <w:t xml:space="preserve">    return ufunc.reduce(obj, axis, dtype, out, **passkwargs)</w:t>
+      </w:r>
+    </w:p>
+    <w:p>
+      <w:r>
+        <w:t>ValueError: zero-size array to reduction operation minimum which has no identity</w:t>
+      </w:r>
     </w:p>
     <w:p/>
     <w:p>
-      <w:r>
-        <w:t>[]</w:t>
-      </w:r>
-    </w:p>
-    <w:p>
-      <w:r>
-        <w:t>D:\thowl_work\research project prework\</w:t>
-      </w:r>
-      <w:proofErr w:type="spellStart"/>
-      <w:r>
-        <w:t>llms</w:t>
-      </w:r>
-      <w:proofErr w:type="spellEnd"/>
-      <w:r>
-        <w:t xml:space="preserve"> and robotics\ai agents\</w:t>
-      </w:r>
-      <w:proofErr w:type="spellStart"/>
-      <w:r>
-        <w:t>my_env</w:t>
-      </w:r>
-      <w:proofErr w:type="spellEnd"/>
-      <w:r>
-        <w:t>\lib\site-packages\</w:t>
-      </w:r>
-      <w:proofErr w:type="spellStart"/>
-      <w:r>
-        <w:t>numpy</w:t>
-      </w:r>
-      <w:proofErr w:type="spellEnd"/>
-      <w:r>
-        <w:t xml:space="preserve">\_core\fromnumeric.py:3596: </w:t>
-      </w:r>
-      <w:proofErr w:type="spellStart"/>
-      <w:r>
-        <w:t>RuntimeWarning</w:t>
-      </w:r>
-      <w:proofErr w:type="spellEnd"/>
-      <w:r>
-        <w:t>: Mean of empty slice.</w:t>
-      </w:r>
-    </w:p>
-    <w:p>
-      <w:r>
-        <w:t xml:space="preserve">  return _</w:t>
-      </w:r>
-      <w:proofErr w:type="spellStart"/>
-      <w:r>
-        <w:t>methods._mean</w:t>
-      </w:r>
-      <w:proofErr w:type="spellEnd"/>
-      <w:r>
-        <w:t xml:space="preserve">(a, axis=axis, </w:t>
-      </w:r>
-      <w:proofErr w:type="spellStart"/>
-      <w:r>
-        <w:t>dtype</w:t>
-      </w:r>
-      <w:proofErr w:type="spellEnd"/>
-      <w:r>
-        <w:t>=</w:t>
-      </w:r>
-      <w:proofErr w:type="spellStart"/>
-      <w:r>
-        <w:t>dtype</w:t>
-      </w:r>
-      <w:proofErr w:type="spellEnd"/>
-      <w:r>
-        <w:t>,</w:t>
-      </w:r>
-    </w:p>
-    <w:p>
-      <w:r>
-        <w:t>D:\thowl_work\research project prework\</w:t>
-      </w:r>
-      <w:proofErr w:type="spellStart"/>
-      <w:r>
-        <w:t>llms</w:t>
-      </w:r>
-      <w:proofErr w:type="spellEnd"/>
-      <w:r>
-        <w:t xml:space="preserve"> and robotics\ai agents\</w:t>
-      </w:r>
-      <w:proofErr w:type="spellStart"/>
-      <w:r>
-        <w:t>my_env</w:t>
-      </w:r>
-      <w:proofErr w:type="spellEnd"/>
-      <w:r>
-        <w:t>\lib\site-packages\</w:t>
-      </w:r>
-      <w:proofErr w:type="spellStart"/>
-      <w:r>
-        <w:t>numpy</w:t>
-      </w:r>
-      <w:proofErr w:type="spellEnd"/>
-      <w:r>
-        <w:t xml:space="preserve">\_core\_methods.py:138: </w:t>
-      </w:r>
-      <w:proofErr w:type="spellStart"/>
-      <w:r>
-        <w:t>RuntimeWarning</w:t>
-      </w:r>
-      <w:proofErr w:type="spellEnd"/>
-      <w:r>
-        <w:t>: invalid value encountered in scalar divide</w:t>
-      </w:r>
-    </w:p>
-    <w:p>
-      <w:r>
-        <w:t xml:space="preserve">  ret = </w:t>
-      </w:r>
-      <w:proofErr w:type="spellStart"/>
-      <w:r>
-        <w:t>ret.dtype.type</w:t>
-      </w:r>
-      <w:proofErr w:type="spellEnd"/>
-      <w:r>
-        <w:t xml:space="preserve">(ret / </w:t>
-      </w:r>
-      <w:proofErr w:type="spellStart"/>
-      <w:r>
-        <w:t>rcount</w:t>
-      </w:r>
-      <w:proofErr w:type="spellEnd"/>
-      <w:r>
-        <w:t>)</w:t>
-      </w:r>
-    </w:p>
-    <w:p>
-      <w:r>
-        <w:t>D:\thowl_work\research project prework\</w:t>
-      </w:r>
-      <w:proofErr w:type="spellStart"/>
-      <w:r>
-        <w:t>llms</w:t>
-      </w:r>
-      <w:proofErr w:type="spellEnd"/>
-      <w:r>
-        <w:t xml:space="preserve"> and robotics\ai agents\</w:t>
-      </w:r>
-      <w:proofErr w:type="spellStart"/>
-      <w:r>
-        <w:t>my_env</w:t>
-      </w:r>
-      <w:proofErr w:type="spellEnd"/>
-      <w:r>
-        <w:t>\lib\site-packages\</w:t>
-      </w:r>
-      <w:proofErr w:type="spellStart"/>
-      <w:r>
-        <w:t>numpy</w:t>
-      </w:r>
-      <w:proofErr w:type="spellEnd"/>
-      <w:r>
-        <w:t xml:space="preserve">\_core\fromnumeric.py:4008: </w:t>
-      </w:r>
-      <w:proofErr w:type="spellStart"/>
-      <w:r>
-        <w:t>RuntimeWarning</w:t>
-      </w:r>
-      <w:proofErr w:type="spellEnd"/>
-      <w:r>
-        <w:t>: Degrees of freedom &lt;= 0 for slice</w:t>
-      </w:r>
-    </w:p>
-    <w:p>
-      <w:r>
-        <w:t xml:space="preserve">  return _</w:t>
-      </w:r>
-      <w:proofErr w:type="spellStart"/>
-      <w:r>
-        <w:t>methods._var</w:t>
-      </w:r>
-      <w:proofErr w:type="spellEnd"/>
-      <w:r>
-        <w:t xml:space="preserve">(a, axis=axis, </w:t>
-      </w:r>
-      <w:proofErr w:type="spellStart"/>
-      <w:r>
-        <w:t>dtype</w:t>
-      </w:r>
-      <w:proofErr w:type="spellEnd"/>
-      <w:r>
-        <w:t>=</w:t>
-      </w:r>
-      <w:proofErr w:type="spellStart"/>
-      <w:r>
-        <w:t>dtype</w:t>
-      </w:r>
-      <w:proofErr w:type="spellEnd"/>
-      <w:r>
-        <w:t xml:space="preserve">, out=out, </w:t>
-      </w:r>
-      <w:proofErr w:type="spellStart"/>
-      <w:r>
-        <w:t>ddof</w:t>
-      </w:r>
-      <w:proofErr w:type="spellEnd"/>
-      <w:r>
-        <w:t>=</w:t>
-      </w:r>
-      <w:proofErr w:type="spellStart"/>
-      <w:r>
-        <w:t>ddof</w:t>
-      </w:r>
-      <w:proofErr w:type="spellEnd"/>
-      <w:r>
-        <w:t>,</w:t>
-      </w:r>
-    </w:p>
-    <w:p>
-      <w:r>
-        <w:t>D:\thowl_work\research project prework\</w:t>
-      </w:r>
-      <w:proofErr w:type="spellStart"/>
-      <w:r>
-        <w:t>llms</w:t>
-      </w:r>
-      <w:proofErr w:type="spellEnd"/>
-      <w:r>
-        <w:t xml:space="preserve"> and robotics\ai agents\</w:t>
-      </w:r>
-      <w:proofErr w:type="spellStart"/>
-      <w:r>
-        <w:t>my_env</w:t>
-      </w:r>
-      <w:proofErr w:type="spellEnd"/>
-      <w:r>
-        <w:t>\lib\site-packages\</w:t>
-      </w:r>
-      <w:proofErr w:type="spellStart"/>
-      <w:r>
-        <w:t>numpy</w:t>
-      </w:r>
-      <w:proofErr w:type="spellEnd"/>
-      <w:r>
-        <w:t xml:space="preserve">\_core\_methods.py:175: </w:t>
-      </w:r>
-      <w:proofErr w:type="spellStart"/>
-      <w:r>
-        <w:t>RuntimeWarning</w:t>
-      </w:r>
-      <w:proofErr w:type="spellEnd"/>
-      <w:r>
-        <w:t>: invalid value encountered in divide</w:t>
-      </w:r>
-    </w:p>
-    <w:p>
-      <w:r>
-        <w:t xml:space="preserve">  </w:t>
-      </w:r>
-      <w:proofErr w:type="spellStart"/>
-      <w:r>
-        <w:t>arrmean</w:t>
-      </w:r>
-      <w:proofErr w:type="spellEnd"/>
-      <w:r>
-        <w:t xml:space="preserve"> = </w:t>
-      </w:r>
-      <w:proofErr w:type="spellStart"/>
-      <w:r>
-        <w:t>um.true_divide</w:t>
-      </w:r>
-      <w:proofErr w:type="spellEnd"/>
-      <w:r>
-        <w:t>(</w:t>
-      </w:r>
-      <w:proofErr w:type="spellStart"/>
-      <w:r>
-        <w:t>arrmean</w:t>
-      </w:r>
-      <w:proofErr w:type="spellEnd"/>
-      <w:r>
-        <w:t>, div, out=</w:t>
-      </w:r>
-      <w:proofErr w:type="spellStart"/>
-      <w:r>
-        <w:t>arrmean</w:t>
-      </w:r>
-      <w:proofErr w:type="spellEnd"/>
-      <w:r>
-        <w:t>,</w:t>
-      </w:r>
-    </w:p>
-    <w:p>
-      <w:r>
-        <w:t>D:\thowl_work\research project prework\</w:t>
-      </w:r>
-      <w:proofErr w:type="spellStart"/>
-      <w:r>
-        <w:t>llms</w:t>
-      </w:r>
-      <w:proofErr w:type="spellEnd"/>
-      <w:r>
-        <w:t xml:space="preserve"> and robotics\ai agents\</w:t>
-      </w:r>
-      <w:proofErr w:type="spellStart"/>
-      <w:r>
-        <w:t>my_env</w:t>
-      </w:r>
-      <w:proofErr w:type="spellEnd"/>
-      <w:r>
-        <w:t>\lib\site-packages\</w:t>
-      </w:r>
-      <w:proofErr w:type="spellStart"/>
-      <w:r>
-        <w:t>numpy</w:t>
-      </w:r>
-      <w:proofErr w:type="spellEnd"/>
-      <w:r>
-        <w:t xml:space="preserve">\_core\_methods.py:210: </w:t>
-      </w:r>
-      <w:proofErr w:type="spellStart"/>
-      <w:r>
-        <w:t>RuntimeWarning</w:t>
-      </w:r>
-      <w:proofErr w:type="spellEnd"/>
-      <w:r>
-        <w:t>: invalid value encountered in scalar divide</w:t>
-      </w:r>
-    </w:p>
-    <w:p>
-      <w:r>
-        <w:t xml:space="preserve">  ret = </w:t>
-      </w:r>
-      <w:proofErr w:type="spellStart"/>
-      <w:r>
-        <w:t>ret.dtype.type</w:t>
-      </w:r>
-      <w:proofErr w:type="spellEnd"/>
-      <w:r>
-        <w:t xml:space="preserve">(ret / </w:t>
-      </w:r>
-      <w:proofErr w:type="spellStart"/>
-      <w:r>
-        <w:t>rcount</w:t>
-      </w:r>
-      <w:proofErr w:type="spellEnd"/>
-      <w:r>
-        <w:t>)</w:t>
-      </w:r>
-    </w:p>
-    <w:p>
-      <w:r>
-        <w:t>D:\thowl_work\research project prework\</w:t>
-      </w:r>
-      <w:proofErr w:type="spellStart"/>
-      <w:r>
-        <w:t>llms</w:t>
-      </w:r>
-      <w:proofErr w:type="spellEnd"/>
-      <w:r>
-        <w:t xml:space="preserve"> and robotics\ai agents\</w:t>
-      </w:r>
-      <w:proofErr w:type="spellStart"/>
-      <w:r>
-        <w:t>my_env</w:t>
-      </w:r>
-      <w:proofErr w:type="spellEnd"/>
-      <w:r>
-        <w:t>\lib\site-packages\</w:t>
-      </w:r>
-      <w:proofErr w:type="spellStart"/>
-      <w:r>
-        <w:t>numpy</w:t>
-      </w:r>
-      <w:proofErr w:type="spellEnd"/>
-      <w:r>
-        <w:t xml:space="preserve">\_core\_methods.py:218: </w:t>
-      </w:r>
-      <w:proofErr w:type="spellStart"/>
-      <w:r>
-        <w:t>RuntimeWarning</w:t>
-      </w:r>
-      <w:proofErr w:type="spellEnd"/>
-      <w:r>
-        <w:t>: Degrees of freedom &lt;= 0 for slice</w:t>
-      </w:r>
-    </w:p>
-    <w:p>
-      <w:r>
-        <w:t xml:space="preserve">  ret = _var(a, axis=axis, </w:t>
-      </w:r>
-      <w:proofErr w:type="spellStart"/>
-      <w:r>
-        <w:t>dtype</w:t>
-      </w:r>
-      <w:proofErr w:type="spellEnd"/>
-      <w:r>
-        <w:t>=</w:t>
-      </w:r>
-      <w:proofErr w:type="spellStart"/>
-      <w:r>
-        <w:t>dtype</w:t>
-      </w:r>
-      <w:proofErr w:type="spellEnd"/>
-      <w:r>
-        <w:t xml:space="preserve">, out=out, </w:t>
-      </w:r>
-      <w:proofErr w:type="spellStart"/>
-      <w:r>
-        <w:t>ddof</w:t>
-      </w:r>
-      <w:proofErr w:type="spellEnd"/>
-      <w:r>
-        <w:t>=</w:t>
-      </w:r>
-      <w:proofErr w:type="spellStart"/>
-      <w:r>
-        <w:t>ddof</w:t>
-      </w:r>
-      <w:proofErr w:type="spellEnd"/>
-      <w:r>
-        <w:t>,</w:t>
-      </w:r>
-    </w:p>
-    <w:p>
-      <w:r>
+      <w:pPr>
+        <w:rPr>
+          <w:sz w:val="24"/>
+          <w:szCs w:val="24"/>
+        </w:rPr>
+      </w:pPr>
+      <w:r>
+        <w:rPr>
+          <w:sz w:val="24"/>
+          <w:szCs w:val="24"/>
+        </w:rPr>
+        <w:t>{'grid_size': [5, 5], 'player_pos': [175, 275], 'crops': {'crop1': {'pos': [400, 275], 'needs_water': True, 'planted': False}, 'crop2': {'pos': [300, 200], 'needs_water': True, 'planted': False}}, 'obstacles': [250, 100], 'water_available': True, 'goal_completed': False}</w:t>
+      </w:r>
+    </w:p>
+    <w:p>
+      <w:pPr>
+        <w:rPr>
+          <w:sz w:val="24"/>
+          <w:szCs w:val="24"/>
+        </w:rPr>
+      </w:pPr>
+      <w:r>
+        <w:rPr>
+          <w:sz w:val="24"/>
+          <w:szCs w:val="24"/>
+        </w:rPr>
+        <w:t>&lt;Response [200]&gt;</w:t>
+      </w:r>
+    </w:p>
+    <w:p>
+      <w:pPr>
+        <w:rPr>
+          <w:sz w:val="24"/>
+          <w:szCs w:val="24"/>
+        </w:rPr>
+      </w:pPr>
+      <w:r>
+        <w:rPr>
+          <w:sz w:val="24"/>
+          <w:szCs w:val="24"/>
+        </w:rPr>
+        <w:t>Hiiii</w:t>
+      </w:r>
+    </w:p>
+    <w:p>
+      <w:pPr>
+        <w:rPr>
+          <w:sz w:val="24"/>
+          <w:szCs w:val="24"/>
+        </w:rPr>
+      </w:pPr>
+      <w:r>
+        <w:rPr>
+          <w:sz w:val="24"/>
+          <w:szCs w:val="24"/>
+        </w:rPr>
         <w:t>Traceback (most recent call last):</w:t>
       </w:r>
     </w:p>
     <w:p>
-      <w:r>
-        <w:t xml:space="preserve">  File "D:\thowl_work\research project prework\</w:t>
-      </w:r>
-      <w:proofErr w:type="spellStart"/>
-      <w:r>
-        <w:t>llms</w:t>
-      </w:r>
-      <w:proofErr w:type="spellEnd"/>
-      <w:r>
-        <w:t xml:space="preserve"> and robotics\ai agents\agentic_approach2.py", line 263, in &lt;module&gt;</w:t>
-      </w:r>
-    </w:p>
-    <w:p>
-      <w:r>
-        <w:t xml:space="preserve">    </w:t>
-      </w:r>
-      <w:proofErr w:type="spellStart"/>
-      <w:r>
-        <w:t>min_val</w:t>
-      </w:r>
-      <w:proofErr w:type="spellEnd"/>
-      <w:r>
-        <w:t xml:space="preserve"> = </w:t>
-      </w:r>
-      <w:proofErr w:type="spellStart"/>
-      <w:r>
-        <w:t>np.min</w:t>
-      </w:r>
-      <w:proofErr w:type="spellEnd"/>
-      <w:r>
-        <w:t>(data)</w:t>
-      </w:r>
-    </w:p>
-    <w:p>
-      <w:r>
-        <w:t xml:space="preserve">  File "D:\thowl_work\research project prework\</w:t>
-      </w:r>
-      <w:proofErr w:type="spellStart"/>
-      <w:r>
-        <w:t>llms</w:t>
-      </w:r>
-      <w:proofErr w:type="spellEnd"/>
-      <w:r>
-        <w:t xml:space="preserve"> and robotics\ai agents\</w:t>
-      </w:r>
-      <w:proofErr w:type="spellStart"/>
-      <w:r>
-        <w:t>my_env</w:t>
-      </w:r>
-      <w:proofErr w:type="spellEnd"/>
-      <w:r>
-        <w:t>\lib\site-packages\</w:t>
-      </w:r>
-      <w:proofErr w:type="spellStart"/>
-      <w:r>
-        <w:t>numpy</w:t>
-      </w:r>
-      <w:proofErr w:type="spellEnd"/>
-      <w:r>
-        <w:t>\_core\fromnumeric.py", line 3042, in min</w:t>
-      </w:r>
-    </w:p>
-    <w:p>
-      <w:r>
-        <w:t xml:space="preserve">    return _</w:t>
-      </w:r>
-      <w:proofErr w:type="spellStart"/>
-      <w:r>
-        <w:t>wrapreduction</w:t>
-      </w:r>
-      <w:proofErr w:type="spellEnd"/>
-      <w:r>
-        <w:t xml:space="preserve">(a, </w:t>
-      </w:r>
-      <w:proofErr w:type="spellStart"/>
-      <w:r>
-        <w:t>np.minimum</w:t>
-      </w:r>
-      <w:proofErr w:type="spellEnd"/>
-      <w:r>
-        <w:t>, 'min', axis, None, out,</w:t>
-      </w:r>
-    </w:p>
-    <w:p>
-      <w:r>
-        <w:t xml:space="preserve">  File "D:\thowl_work\research project prework\</w:t>
-      </w:r>
-      <w:proofErr w:type="spellStart"/>
-      <w:r>
-        <w:t>llms</w:t>
-      </w:r>
-      <w:proofErr w:type="spellEnd"/>
-      <w:r>
-        <w:t xml:space="preserve"> and robotics\ai agents\</w:t>
-      </w:r>
-      <w:proofErr w:type="spellStart"/>
-      <w:r>
-        <w:t>my_env</w:t>
-      </w:r>
-      <w:proofErr w:type="spellEnd"/>
-      <w:r>
-        <w:t>\lib\site-packages\</w:t>
-      </w:r>
-      <w:proofErr w:type="spellStart"/>
-      <w:r>
-        <w:t>numpy</w:t>
-      </w:r>
-      <w:proofErr w:type="spellEnd"/>
-      <w:r>
-        <w:t>\_core\fromnumeric.py", line 86, in _</w:t>
-      </w:r>
-      <w:proofErr w:type="spellStart"/>
-      <w:r>
-        <w:t>wrapreduction</w:t>
-      </w:r>
-      <w:proofErr w:type="spellEnd"/>
-    </w:p>
-    <w:p>
-      <w:r>
-        <w:t xml:space="preserve">    return </w:t>
-      </w:r>
-      <w:proofErr w:type="spellStart"/>
-      <w:r>
-        <w:t>ufunc.reduce</w:t>
-      </w:r>
-      <w:proofErr w:type="spellEnd"/>
-      <w:r>
-        <w:t>(</w:t>
-      </w:r>
-      <w:proofErr w:type="spellStart"/>
-      <w:r>
-        <w:t>obj</w:t>
-      </w:r>
-      <w:proofErr w:type="spellEnd"/>
-      <w:r>
-        <w:t xml:space="preserve">, axis, </w:t>
-      </w:r>
-      <w:proofErr w:type="spellStart"/>
-      <w:r>
-        <w:t>dtype</w:t>
-      </w:r>
-      <w:proofErr w:type="spellEnd"/>
-      <w:r>
-        <w:t>, out, **</w:t>
-      </w:r>
-      <w:proofErr w:type="spellStart"/>
-      <w:r>
-        <w:t>passkwargs</w:t>
-      </w:r>
-      <w:proofErr w:type="spellEnd"/>
-      <w:r>
-        <w:t>)</w:t>
-      </w:r>
-    </w:p>
-    <w:p>
-      <w:proofErr w:type="spellStart"/>
-      <w:r>
+      <w:pPr>
+        <w:rPr>
+          <w:sz w:val="24"/>
+          <w:szCs w:val="24"/>
+        </w:rPr>
+      </w:pPr>
+      <w:r>
+        <w:rPr>
+          <w:sz w:val="24"/>
+          <w:szCs w:val="24"/>
+        </w:rPr>
+        <w:t xml:space="preserve">  File "D:\thowl_work\research project prework\llms and robotics\ai agents\agentic_approach2.py", line 232, in &lt;module&gt;</w:t>
+      </w:r>
+    </w:p>
+    <w:p>
+      <w:pPr>
+        <w:rPr>
+          <w:sz w:val="24"/>
+          <w:szCs w:val="24"/>
+        </w:rPr>
+      </w:pPr>
+      <w:r>
+        <w:rPr>
+          <w:sz w:val="24"/>
+          <w:szCs w:val="24"/>
+        </w:rPr>
+        <w:t xml:space="preserve">    response: ChatResponse = client.chat(model=model, messages=messages, tools=[move,water,astar,collect_water,plant_crop])</w:t>
+      </w:r>
+    </w:p>
+    <w:p>
+      <w:pPr>
+        <w:rPr>
+          <w:sz w:val="24"/>
+          <w:szCs w:val="24"/>
+        </w:rPr>
+      </w:pPr>
+      <w:r>
+        <w:rPr>
+          <w:sz w:val="24"/>
+          <w:szCs w:val="24"/>
+        </w:rPr>
+        <w:t xml:space="preserve">  File "D:\thowl_work\research project prework\llms and robotics\ai agents\my_env\lib\site-packages\ollama\_client.py", line 365, in chat</w:t>
+      </w:r>
+    </w:p>
+    <w:p>
+      <w:pPr>
+        <w:rPr>
+          <w:sz w:val="24"/>
+          <w:szCs w:val="24"/>
+        </w:rPr>
+      </w:pPr>
+      <w:r>
+        <w:rPr>
+          <w:sz w:val="24"/>
+          <w:szCs w:val="24"/>
+        </w:rPr>
+        <w:t xml:space="preserve">    return self._request(</w:t>
+      </w:r>
+    </w:p>
+    <w:p>
+      <w:pPr>
+        <w:rPr>
+          <w:sz w:val="24"/>
+          <w:szCs w:val="24"/>
+        </w:rPr>
+      </w:pPr>
+      <w:r>
+        <w:rPr>
+          <w:sz w:val="24"/>
+          <w:szCs w:val="24"/>
+        </w:rPr>
+        <w:t xml:space="preserve">  File "D:\thowl_work\research project prework\llms and robotics\ai agents\my_env\lib\site-packages\ollama\_client.py", line 189, in _request</w:t>
+      </w:r>
+    </w:p>
+    <w:p>
+      <w:pPr>
+        <w:rPr>
+          <w:sz w:val="24"/>
+          <w:szCs w:val="24"/>
+        </w:rPr>
+      </w:pPr>
+      <w:r>
+        <w:rPr>
+          <w:sz w:val="24"/>
+          <w:szCs w:val="24"/>
+        </w:rPr>
+        <w:t xml:space="preserve">    return cls(**self._request_raw(*args, **kwargs).json())</w:t>
+      </w:r>
+    </w:p>
+    <w:p>
+      <w:pPr>
+        <w:rPr>
+          <w:sz w:val="24"/>
+          <w:szCs w:val="24"/>
+        </w:rPr>
+      </w:pPr>
+      <w:r>
+        <w:rPr>
+          <w:sz w:val="24"/>
+          <w:szCs w:val="24"/>
+        </w:rPr>
+        <w:t xml:space="preserve">  File "D:\thowl_work\research project prework\llms and robotics\ai agents\my_env\lib\site-packages\ollama\_client.py", line 133, in _request_raw</w:t>
+      </w:r>
+    </w:p>
+    <w:p>
+      <w:pPr>
+        <w:rPr>
+          <w:sz w:val="24"/>
+          <w:szCs w:val="24"/>
+        </w:rPr>
+      </w:pPr>
+      <w:r>
+        <w:rPr>
+          <w:sz w:val="24"/>
+          <w:szCs w:val="24"/>
+        </w:rPr>
+        <w:t xml:space="preserve">    raise ResponseError(e.response.text, e.response.status_code) from None</w:t>
+      </w:r>
+    </w:p>
+    <w:p>
+      <w:pPr>
+        <w:rPr>
+          <w:sz w:val="24"/>
+          <w:szCs w:val="24"/>
+        </w:rPr>
+      </w:pPr>
+      <w:r>
+        <w:rPr>
+          <w:sz w:val="24"/>
+          <w:szCs w:val="24"/>
+        </w:rPr>
+        <w:t>ollama._types.ResponseError: error parsing tool call: raw='', err=unexpected end of JSON input (status code: 500)</w:t>
+      </w:r>
+    </w:p>
+    <w:p>
+      <w:pPr>
+        <w:rPr>
+          <w:sz w:val="24"/>
+          <w:szCs w:val="24"/>
+        </w:rPr>
+      </w:pPr>
+    </w:p>
+    <w:p>
+      <w:pPr>
+        <w:rPr>
+          <w:sz w:val="24"/>
+          <w:szCs w:val="24"/>
+        </w:rPr>
+      </w:pPr>
+      <w:r>
+        <w:rPr>
+          <w:sz w:val="24"/>
+          <w:szCs w:val="24"/>
+        </w:rPr>
+        <w:t>same error</w:t>
+      </w:r>
+    </w:p>
+    <w:p>
+      <w:pPr>
+        <w:rPr>
+          <w:sz w:val="24"/>
+          <w:szCs w:val="24"/>
+        </w:rPr>
+      </w:pPr>
+      <w:r>
+        <w:rPr>
+          <w:sz w:val="24"/>
+          <w:szCs w:val="24"/>
+        </w:rPr>
+        <w:t>Hiiii</w:t>
+      </w:r>
+    </w:p>
+    <w:p>
+      <w:pPr>
+        <w:rPr>
+          <w:sz w:val="24"/>
+          <w:szCs w:val="24"/>
+        </w:rPr>
+      </w:pPr>
+      <w:r>
+        <w:rPr>
+          <w:sz w:val="24"/>
+          <w:szCs w:val="24"/>
+        </w:rPr>
+        <w:t>Traceback (most recent call last):</w:t>
+      </w:r>
+    </w:p>
+    <w:p>
+      <w:pPr>
+        <w:rPr>
+          <w:sz w:val="24"/>
+          <w:szCs w:val="24"/>
+        </w:rPr>
+      </w:pPr>
+      <w:r>
+        <w:rPr>
+          <w:sz w:val="24"/>
+          <w:szCs w:val="24"/>
+        </w:rPr>
+        <w:t xml:space="preserve">  File "D:\thowl_work\research project prework\llms and robotics\ai agents\agentic_approach2.py", line 232, in &lt;module&gt;</w:t>
+      </w:r>
+    </w:p>
+    <w:p>
+      <w:pPr>
+        <w:rPr>
+          <w:sz w:val="24"/>
+          <w:szCs w:val="24"/>
+        </w:rPr>
+      </w:pPr>
+      <w:r>
+        <w:rPr>
+          <w:sz w:val="24"/>
+          <w:szCs w:val="24"/>
+        </w:rPr>
         <w:lastRenderedPageBreak/>
-        <w:t>ValueError</w:t>
-      </w:r>
-      <w:proofErr w:type="spellEnd"/>
-      <w:r>
-        <w:t>: zero-size array to reduction operation minimum which has no identity</w:t>
+        <w:t xml:space="preserve">    response: ChatResponse = client.chat(model=model, messages=messages, tools=[move,water,astar,collect_water,plant_crop])</w:t>
+      </w:r>
+    </w:p>
+    <w:p>
+      <w:pPr>
+        <w:rPr>
+          <w:sz w:val="24"/>
+          <w:szCs w:val="24"/>
+        </w:rPr>
+      </w:pPr>
+      <w:r>
+        <w:rPr>
+          <w:sz w:val="24"/>
+          <w:szCs w:val="24"/>
+        </w:rPr>
+        <w:t xml:space="preserve">  File "D:\thowl_work\research project prework\llms and robotics\ai agents\my_env\lib\site-packages\ollama\_client.py", line 365, in chat</w:t>
+      </w:r>
+    </w:p>
+    <w:p>
+      <w:pPr>
+        <w:rPr>
+          <w:sz w:val="24"/>
+          <w:szCs w:val="24"/>
+        </w:rPr>
+      </w:pPr>
+      <w:r>
+        <w:rPr>
+          <w:sz w:val="24"/>
+          <w:szCs w:val="24"/>
+        </w:rPr>
+        <w:t xml:space="preserve">    return self._request(</w:t>
+      </w:r>
+    </w:p>
+    <w:p>
+      <w:pPr>
+        <w:rPr>
+          <w:sz w:val="24"/>
+          <w:szCs w:val="24"/>
+        </w:rPr>
+      </w:pPr>
+      <w:r>
+        <w:rPr>
+          <w:sz w:val="24"/>
+          <w:szCs w:val="24"/>
+        </w:rPr>
+        <w:t xml:space="preserve">  File "D:\thowl_work\research project prework\llms and robotics\ai agents\my_env\lib\site-packages\ollama\_client.py", line 189, in _request</w:t>
+      </w:r>
+    </w:p>
+    <w:p>
+      <w:pPr>
+        <w:rPr>
+          <w:sz w:val="24"/>
+          <w:szCs w:val="24"/>
+        </w:rPr>
+      </w:pPr>
+      <w:r>
+        <w:rPr>
+          <w:sz w:val="24"/>
+          <w:szCs w:val="24"/>
+        </w:rPr>
+        <w:t xml:space="preserve">    return cls(**self._request_raw(*args, **kwargs).json())</w:t>
+      </w:r>
+    </w:p>
+    <w:p>
+      <w:pPr>
+        <w:rPr>
+          <w:sz w:val="24"/>
+          <w:szCs w:val="24"/>
+        </w:rPr>
+      </w:pPr>
+      <w:r>
+        <w:rPr>
+          <w:sz w:val="24"/>
+          <w:szCs w:val="24"/>
+        </w:rPr>
+        <w:t xml:space="preserve">  File "D:\thowl_work\research project prework\llms and robotics\ai agents\my_env\lib\site-packages\ollama\_client.py", line 133, in _request_raw</w:t>
+      </w:r>
+    </w:p>
+    <w:p>
+      <w:pPr>
+        <w:rPr>
+          <w:sz w:val="24"/>
+          <w:szCs w:val="24"/>
+        </w:rPr>
+      </w:pPr>
+      <w:r>
+        <w:rPr>
+          <w:sz w:val="24"/>
+          <w:szCs w:val="24"/>
+        </w:rPr>
+        <w:t xml:space="preserve">    raise ResponseError(e.response.text, e.response.status_code) from None</w:t>
+      </w:r>
+    </w:p>
+    <w:p>
+      <w:pPr>
+        <w:rPr>
+          <w:sz w:val="24"/>
+          <w:szCs w:val="24"/>
+        </w:rPr>
+      </w:pPr>
+      <w:r>
+        <w:rPr>
+          <w:sz w:val="24"/>
+          <w:szCs w:val="24"/>
+        </w:rPr>
+        <w:t>ollama._types.ResponseError: error parsing tool call: raw='', err=unexpected end of JSON input (status code: 500)</w:t>
+      </w:r>
+    </w:p>
+    <w:p>
+      <w:pPr>
+        <w:rPr>
+          <w:sz w:val="24"/>
+          <w:szCs w:val="24"/>
+        </w:rPr>
+      </w:pPr>
+    </w:p>
+    <w:p>
+      <w:pPr>
+        <w:rPr>
+          <w:sz w:val="24"/>
+          <w:szCs w:val="24"/>
+        </w:rPr>
+      </w:pPr>
+    </w:p>
+    <w:p>
+      <w:pPr>
+        <w:rPr>
+          <w:b/>
+          <w:bCs/>
+          <w:sz w:val="36"/>
+          <w:szCs w:val="36"/>
+        </w:rPr>
+      </w:pPr>
+      <w:r>
+        <w:rPr>
+          <w:b/>
+          <w:bCs/>
+          <w:sz w:val="36"/>
+          <w:szCs w:val="36"/>
+        </w:rPr>
+        <w:t>Planting the crops:-</w:t>
+      </w:r>
+    </w:p>
+    <w:p>
+      <w:pPr>
+        <w:rPr>
+          <w:sz w:val="24"/>
+          <w:szCs w:val="24"/>
+        </w:rPr>
+      </w:pPr>
+      <w:r>
+        <w:rPr>
+          <w:sz w:val="24"/>
+          <w:szCs w:val="24"/>
+        </w:rPr>
+        <w:t>system_message2 = f"""</w:t>
+      </w:r>
+    </w:p>
+    <w:p>
+      <w:pPr>
+        <w:rPr>
+          <w:sz w:val="24"/>
+          <w:szCs w:val="24"/>
+        </w:rPr>
+      </w:pPr>
+    </w:p>
+    <w:p>
+      <w:pPr>
+        <w:rPr>
+          <w:sz w:val="24"/>
+          <w:szCs w:val="24"/>
+        </w:rPr>
+      </w:pPr>
+      <w:r>
+        <w:rPr>
+          <w:sz w:val="24"/>
+          <w:szCs w:val="24"/>
+        </w:rPr>
+        <w:t>you are smart farm game agent.</w:t>
+      </w:r>
+    </w:p>
+    <w:p>
+      <w:pPr>
+        <w:rPr>
+          <w:sz w:val="24"/>
+          <w:szCs w:val="24"/>
+        </w:rPr>
+      </w:pPr>
+    </w:p>
+    <w:p>
+      <w:pPr>
+        <w:rPr>
+          <w:sz w:val="24"/>
+          <w:szCs w:val="24"/>
+        </w:rPr>
+      </w:pPr>
+      <w:r>
+        <w:rPr>
+          <w:sz w:val="24"/>
+          <w:szCs w:val="24"/>
+        </w:rPr>
+        <w:t>Your task:</w:t>
+      </w:r>
+    </w:p>
+    <w:p>
+      <w:pPr>
+        <w:rPr>
+          <w:sz w:val="24"/>
+          <w:szCs w:val="24"/>
+        </w:rPr>
+      </w:pPr>
+      <w:r>
+        <w:rPr>
+          <w:sz w:val="24"/>
+          <w:szCs w:val="24"/>
+        </w:rPr>
+        <w:t>1. planting the crops by going to the given coordinates.</w:t>
+      </w:r>
+    </w:p>
+    <w:p>
+      <w:pPr>
+        <w:rPr>
+          <w:sz w:val="24"/>
+          <w:szCs w:val="24"/>
+        </w:rPr>
+      </w:pPr>
+      <w:r>
+        <w:rPr>
+          <w:sz w:val="24"/>
+          <w:szCs w:val="24"/>
+        </w:rPr>
+        <w:t xml:space="preserve">2. Water needs to </w:t>
+      </w:r>
+      <w:proofErr w:type="gramStart"/>
+      <w:r>
+        <w:rPr>
+          <w:sz w:val="24"/>
+          <w:szCs w:val="24"/>
+        </w:rPr>
+        <w:t>collected</w:t>
+      </w:r>
+      <w:proofErr w:type="gramEnd"/>
+      <w:r>
+        <w:rPr>
+          <w:sz w:val="24"/>
+          <w:szCs w:val="24"/>
+        </w:rPr>
+        <w:t xml:space="preserve"> to plant water.</w:t>
+      </w:r>
+    </w:p>
+    <w:p>
+      <w:pPr>
+        <w:rPr>
+          <w:sz w:val="24"/>
+          <w:szCs w:val="24"/>
+        </w:rPr>
+      </w:pPr>
+      <w:r>
+        <w:rPr>
+          <w:sz w:val="24"/>
+          <w:szCs w:val="24"/>
+        </w:rPr>
+        <w:t>3. Reach the water tank to collect water.</w:t>
+      </w:r>
+    </w:p>
+    <w:p>
+      <w:pPr>
+        <w:rPr>
+          <w:sz w:val="24"/>
+          <w:szCs w:val="24"/>
+        </w:rPr>
+      </w:pPr>
+    </w:p>
+    <w:p>
+      <w:pPr>
+        <w:rPr>
+          <w:sz w:val="24"/>
+          <w:szCs w:val="24"/>
+        </w:rPr>
+      </w:pPr>
+      <w:r>
+        <w:rPr>
+          <w:sz w:val="24"/>
+          <w:szCs w:val="24"/>
+        </w:rPr>
+        <w:t>IMPORTANT.</w:t>
+      </w:r>
+    </w:p>
+    <w:p>
+      <w:pPr>
+        <w:rPr>
+          <w:sz w:val="24"/>
+          <w:szCs w:val="24"/>
+        </w:rPr>
+      </w:pPr>
+      <w:r>
+        <w:rPr>
+          <w:sz w:val="24"/>
+          <w:szCs w:val="24"/>
+        </w:rPr>
+        <w:t xml:space="preserve"> check if the crops are planted.</w:t>
+      </w:r>
+    </w:p>
+    <w:p>
+      <w:pPr>
+        <w:rPr>
+          <w:sz w:val="24"/>
+          <w:szCs w:val="24"/>
+        </w:rPr>
+      </w:pPr>
+      <w:r>
+        <w:rPr>
+          <w:sz w:val="24"/>
+          <w:szCs w:val="24"/>
+        </w:rPr>
+        <w:t>WORLD STATE:</w:t>
+      </w:r>
+    </w:p>
+    <w:p>
+      <w:pPr>
+        <w:rPr>
+          <w:sz w:val="24"/>
+          <w:szCs w:val="24"/>
+        </w:rPr>
+      </w:pPr>
+      <w:r>
+        <w:rPr>
+          <w:sz w:val="24"/>
+          <w:szCs w:val="24"/>
+        </w:rPr>
+        <w:t>CURRENT STATE (authoritative):</w:t>
+      </w:r>
+    </w:p>
+    <w:p>
+      <w:pPr>
+        <w:rPr>
+          <w:sz w:val="24"/>
+          <w:szCs w:val="24"/>
+        </w:rPr>
+      </w:pPr>
+      <w:r>
+        <w:rPr>
+          <w:sz w:val="24"/>
+          <w:szCs w:val="24"/>
+        </w:rPr>
+        <w:t>Grid size: {state['grid_size']}</w:t>
+      </w:r>
+    </w:p>
+    <w:p>
+      <w:pPr>
+        <w:rPr>
+          <w:sz w:val="24"/>
+          <w:szCs w:val="24"/>
+        </w:rPr>
+      </w:pPr>
+      <w:r>
+        <w:rPr>
+          <w:sz w:val="24"/>
+          <w:szCs w:val="24"/>
+        </w:rPr>
+        <w:t>Player position: {tuple(state['player_pos'])}</w:t>
+      </w:r>
+    </w:p>
+    <w:p>
+      <w:pPr>
+        <w:rPr>
+          <w:sz w:val="24"/>
+          <w:szCs w:val="24"/>
+        </w:rPr>
+      </w:pPr>
+      <w:r>
+        <w:rPr>
+          <w:sz w:val="24"/>
+          <w:szCs w:val="24"/>
+        </w:rPr>
+        <w:lastRenderedPageBreak/>
+        <w:t>Crops:</w:t>
+      </w:r>
+    </w:p>
+    <w:p>
+      <w:pPr>
+        <w:rPr>
+          <w:sz w:val="24"/>
+          <w:szCs w:val="24"/>
+        </w:rPr>
+      </w:pPr>
+      <w:r>
+        <w:rPr>
+          <w:sz w:val="24"/>
+          <w:szCs w:val="24"/>
+        </w:rPr>
+        <w:t>{crops_to_text(state['crops'])}</w:t>
+      </w:r>
+    </w:p>
+    <w:p>
+      <w:pPr>
+        <w:rPr>
+          <w:sz w:val="24"/>
+          <w:szCs w:val="24"/>
+        </w:rPr>
+      </w:pPr>
+    </w:p>
+    <w:p>
+      <w:pPr>
+        <w:rPr>
+          <w:sz w:val="24"/>
+          <w:szCs w:val="24"/>
+        </w:rPr>
+      </w:pPr>
+      <w:r>
+        <w:rPr>
+          <w:sz w:val="24"/>
+          <w:szCs w:val="24"/>
+        </w:rPr>
+        <w:t>Obstacles:</w:t>
+      </w:r>
+    </w:p>
+    <w:p>
+      <w:pPr>
+        <w:rPr>
+          <w:sz w:val="24"/>
+          <w:szCs w:val="24"/>
+        </w:rPr>
+      </w:pPr>
+      <w:r>
+        <w:rPr>
+          <w:sz w:val="24"/>
+          <w:szCs w:val="24"/>
+        </w:rPr>
+        <w:t>{list(state['obstacles'])}</w:t>
+      </w:r>
+    </w:p>
+    <w:p>
+      <w:pPr>
+        <w:rPr>
+          <w:sz w:val="24"/>
+          <w:szCs w:val="24"/>
+        </w:rPr>
+      </w:pPr>
+    </w:p>
+    <w:p>
+      <w:pPr>
+        <w:rPr>
+          <w:sz w:val="24"/>
+          <w:szCs w:val="24"/>
+        </w:rPr>
+      </w:pPr>
+      <w:r>
+        <w:rPr>
+          <w:sz w:val="24"/>
+          <w:szCs w:val="24"/>
+        </w:rPr>
+        <w:t>Water_available:</w:t>
+      </w:r>
+    </w:p>
+    <w:p>
+      <w:pPr>
+        <w:rPr>
+          <w:sz w:val="24"/>
+          <w:szCs w:val="24"/>
+        </w:rPr>
+      </w:pPr>
+      <w:r>
+        <w:rPr>
+          <w:sz w:val="24"/>
+          <w:szCs w:val="24"/>
+        </w:rPr>
+        <w:t>{state["water_available"]}</w:t>
+      </w:r>
+    </w:p>
+    <w:p>
+      <w:pPr>
+        <w:rPr>
+          <w:sz w:val="24"/>
+          <w:szCs w:val="24"/>
+        </w:rPr>
+      </w:pPr>
+      <w:r>
+        <w:rPr>
+          <w:sz w:val="24"/>
+          <w:szCs w:val="24"/>
+        </w:rPr>
+        <w:t>Water_tank:</w:t>
+      </w:r>
+    </w:p>
+    <w:p>
+      <w:pPr>
+        <w:rPr>
+          <w:sz w:val="24"/>
+          <w:szCs w:val="24"/>
+        </w:rPr>
+      </w:pPr>
+      <w:r>
+        <w:rPr>
+          <w:sz w:val="24"/>
+          <w:szCs w:val="24"/>
+        </w:rPr>
+        <w:t>{list(state['water_tank'])}</w:t>
+      </w:r>
+    </w:p>
+    <w:p>
+      <w:pPr>
+        <w:rPr>
+          <w:sz w:val="24"/>
+          <w:szCs w:val="24"/>
+        </w:rPr>
+      </w:pPr>
+    </w:p>
+    <w:p>
+      <w:pPr>
+        <w:rPr>
+          <w:sz w:val="24"/>
+          <w:szCs w:val="24"/>
+        </w:rPr>
+      </w:pPr>
+    </w:p>
+    <w:p>
+      <w:pPr>
+        <w:rPr>
+          <w:sz w:val="24"/>
+          <w:szCs w:val="24"/>
+        </w:rPr>
+      </w:pPr>
+      <w:r>
+        <w:rPr>
+          <w:sz w:val="24"/>
+          <w:szCs w:val="24"/>
+        </w:rPr>
+        <w:t xml:space="preserve">  To calculate the distance should use the astar algorithm tool</w:t>
+      </w:r>
+    </w:p>
+    <w:p>
+      <w:pPr>
+        <w:rPr>
+          <w:sz w:val="24"/>
+          <w:szCs w:val="24"/>
+        </w:rPr>
+      </w:pPr>
+      <w:r>
+        <w:rPr>
+          <w:sz w:val="24"/>
+          <w:szCs w:val="24"/>
+        </w:rPr>
+        <w:t xml:space="preserve">  move 25pxs and one side at a time</w:t>
+      </w:r>
+    </w:p>
+    <w:p>
+      <w:pPr>
+        <w:rPr>
+          <w:sz w:val="24"/>
+          <w:szCs w:val="24"/>
+        </w:rPr>
+      </w:pPr>
+      <w:r>
+        <w:rPr>
+          <w:sz w:val="24"/>
+          <w:szCs w:val="24"/>
+        </w:rPr>
+        <w:t xml:space="preserve">  and not allowed to pass through the crop and crops are not obstacles.</w:t>
+      </w:r>
+    </w:p>
+    <w:p>
+      <w:pPr>
+        <w:rPr>
+          <w:sz w:val="24"/>
+          <w:szCs w:val="24"/>
+        </w:rPr>
+      </w:pPr>
+    </w:p>
+    <w:p>
+      <w:pPr>
+        <w:rPr>
+          <w:sz w:val="24"/>
+          <w:szCs w:val="24"/>
+        </w:rPr>
+      </w:pPr>
+      <w:r>
+        <w:rPr>
+          <w:sz w:val="24"/>
+          <w:szCs w:val="24"/>
+        </w:rPr>
+        <w:t>"""</w:t>
+      </w:r>
+    </w:p>
+    <w:p/>
+    <w:p>
+      <w:r>
+        <w:t>[13.75292444229126, 0.5827114582061768, 0.5630519390106201, 0.6044938564300537, 0.7178499698638916, 0.844757080078125, 2.8402979373931885, 0.6872847080230713, 0.7596278190612793, 0.7720048427581787, 0.8462302684783936, 0.8408200740814209, 0.9543511867523193, 0.8906815052032471, 0.9716477394104004, 0.985349178314209, 0.997161865234375, 1.2572636604309082, 1.1851444244384766, 1.6911580562591553, 1.8321733474731445, 2.2113819122314453, 1.466292381286621, 1.553107500076294, 1.6025731563568115, 1.686044454574585, 1.7387745380401611, 1.9242956638336182, 1.9635860919952393, 1.9701311588287354, 2.0147287845611572, 2.120971441268921, 2.219012498855591, 2.964493751525879, 3.944519281387329, 2.6577847003936768, 2.6544110774993896, 2.8194546699523926, 2.86484432220459, 3.0310428142547607, 3.193195104598999, 3.327493667602539, 3.8203446865081787]</w:t>
+      </w:r>
+    </w:p>
+    <w:p>
+      <w:r>
+        <w:t>No of llms calls:-</w:t>
+      </w:r>
+    </w:p>
+    <w:p>
+      <w:r>
+        <w:t>43</w:t>
+      </w:r>
+    </w:p>
+    <w:p>
+      <w:r>
+        <w:t>player positons:</w:t>
+      </w:r>
+    </w:p>
+    <w:p>
+      <w:r>
+        <w:t xml:space="preserve">[[225, 125], [250, 150], [275, 175], [300, 200], [300, 200], [300, 200], [275, 200], [250, 200], [225, 200], [200, 200], [175, 200], [150, 200], [125, 200], [100, 200], [75, 200], [75, 225], [75, 250], [80, </w:t>
+      </w:r>
+      <w:r>
+        <w:lastRenderedPageBreak/>
+        <w:t>250], [80, 250], [80, 250], [75, 250], [75, 225], [75, 200], [100, 200], [125, 200], [150, 200], [175, 200], [200, 200], [225, 200], [250, 200], [275, 200], [300, 200], [300, 200], [300, 200], [300, 225], [300, 250], [300, 275], [325, 275], [350, 275], [375, 275], [400, 275], [400, 275], [400, 275]]</w:t>
+      </w:r>
+    </w:p>
+    <w:p/>
+    <w:p>
+      <w:r>
+        <w:t>2</w:t>
+      </w:r>
+      <w:r>
+        <w:rPr>
+          <w:vertAlign w:val="superscript"/>
+        </w:rPr>
+        <w:t>nd</w:t>
+      </w:r>
+      <w:r>
+        <w:t xml:space="preserve"> iteration</w:t>
+      </w:r>
+    </w:p>
+    <w:p>
+      <w:r>
+        <w:t>[118.23334574699402, 25.57296371459961, 7.442728281021118, 7.121592998504639, 1.5539138317108154, 1.7537529468536377, 1.6270654201507568, 1.5911390781402588, 1.757284164428711, 1.66801118850708, 1.865922451019287, 1.7445054054260254, 1.8564848899841309, 1.7750306129455566, 1.5856618881225586, 1.9932034015655518, 1.9033689498901367, 1.9754533767700195, 2.0129427909851074, 2.2736868858337402, 2.2004616260528564, 1.9267704486846924, 2.445718765258789, 2.385659694671631, 2.5079991817474365, 2.473893404006958, 2.4852588176727295, 2.7615463733673096, 2.6084234714508057, 2.6994197368621826, 2.440880298614502, 3.5028562545776367, 3.0029189586639404, 3.0703253746032715, 3.254619598388672, 3.1951045989990234, 3.1843209266662598, 3.4612135887145996, 3.620239734649658, 3.1447763442993164]</w:t>
+      </w:r>
+    </w:p>
+    <w:p>
+      <w:r>
+        <w:t>No of llms calls:-</w:t>
+      </w:r>
+    </w:p>
+    <w:p>
+      <w:r>
+        <w:t>40</w:t>
+      </w:r>
+    </w:p>
+    <w:p>
+      <w:r>
+        <w:t>player positons:</w:t>
+      </w:r>
+    </w:p>
+    <w:p>
+      <w:r>
+        <w:t>[[200, 100], [200, 100], [200, 100], [175, 100], [150, 100], [125, 100], [100, 100], [75, 100], [75, 125], [75, 150], [75, 175], [75, 200], [75, 225], [75, 250], [75, 250], [100, 250], [125, 250], [150, 250], [175, 250], [200, 250], [225, 250], [250, 250], [275, 250], [300, 250], [325, 250], [350, 250], [375, 250], [400, 250], [400, 275], [400, 275], [400, 275], [375, 275], [350, 275], [325, 275], [300, 275], [300, 250], [300, 225], [300, 200], [300, 200], [300, 200]]</w:t>
       </w:r>
     </w:p>
     <w:sectPr>

</xml_diff>